<commit_message>
Optimize: Mots-clés SEO pour Google Business (4 pays) + Communiqué presse
</commit_message>
<xml_diff>
--- a/docs/COMMUNIQUE-PRESSE.docx
+++ b/docs/COMMUNIQUE-PRESSE.docx
@@ -30,13 +30,13 @@
         </w:pict>
       </w:r>
     </w:p>
-    <w:bookmarkStart w:id="25" w:name="X45ad198be981e6030aeb31702cadb04e7c48171"/>
+    <w:bookmarkStart w:id="25" w:name="Xa32b8b204d4e484f25d73b33d760ac03f413385"/>
     <w:p>
       <w:pPr>
         <w:pStyle w:val="Heading2"/>
       </w:pPr>
       <w:r>
-        <w:t xml:space="preserve">AlerteMarché lance sa plateforme de veille des marchés publics en Afrique de l’Ouest</w:t>
+        <w:t xml:space="preserve">AlerteMarché lance sa plateforme de veille automatisée des appels d’offres et marchés publics en Afrique de l’Ouest</w:t>
       </w:r>
     </w:p>
     <w:p>
@@ -67,7 +67,7 @@
         <w:t xml:space="preserve"> </w:t>
       </w:r>
       <w:r>
-        <w:t xml:space="preserve">(https://alertemarche.com), la première plateforme panafricaine de veille automatisée des appels d’offres et marchés publics au Bénin, Togo, Côte d’Ivoire et Sénégal.</w:t>
+        <w:t xml:space="preserve">(https://alertemarche.com), la première plateforme panafricaine de veille automatisée des appels d’offres et marchés publics au Bénin, Togo, Côte d’Ivoire et Sénégal. Les entreprises reçoivent désormais par e-mail les appels d’offres correspondant à leur secteur, dès leur publication sur les portails officiels (ARMP, ANRMP, DNCMP).</w:t>
       </w:r>
     </w:p>
     <w:bookmarkStart w:id="20" w:name="X769ec8fcac8611299476cd4c79cdeba085d1d2c"/>
@@ -104,13 +104,13 @@
       </w:r>
     </w:p>
     <w:bookmarkEnd w:id="20"/>
-    <w:bookmarkStart w:id="21" w:name="fonctionnalités-clés"/>
+    <w:bookmarkStart w:id="21" w:name="Xfc3ab46d7d501e15bd98e1329a60716b2229eb9"/>
     <w:p>
       <w:pPr>
         <w:pStyle w:val="Heading3"/>
       </w:pPr>
       <w:r>
-        <w:t xml:space="preserve">Fonctionnalités clés</w:t>
+        <w:t xml:space="preserve">Fonctionnalités clés pour les marchés publics d’Afrique de l’Ouest</w:t>
       </w:r>
     </w:p>
     <w:p>
@@ -126,13 +126,13 @@
           <w:bCs/>
           <w:b/>
         </w:rPr>
-        <w:t xml:space="preserve">Veille automatique 24h/24</w:t>
-      </w:r>
-      <w:r>
-        <w:t xml:space="preserve"> </w:t>
-      </w:r>
-      <w:r>
-        <w:t xml:space="preserve">: collecte en temps réel depuis les sources officielles (ARMP, ANRMP, DNCMP, portails nationaux)</w:t>
+        <w:t xml:space="preserve">Veille automatique 24h/24 des appels d’offres</w:t>
+      </w:r>
+      <w:r>
+        <w:t xml:space="preserve"> </w:t>
+      </w:r>
+      <w:r>
+        <w:t xml:space="preserve">: collecte en temps réel depuis les sources officielles (ARMP Bénin, ARMP Togo, ARMP Sénégal, ANRMP Côte d’Ivoire, DNCMP, DNCCP, portails nationaux de marchés publics)</w:t>
       </w:r>
     </w:p>
     <w:p>
@@ -148,13 +148,13 @@
           <w:bCs/>
           <w:b/>
         </w:rPr>
-        <w:t xml:space="preserve">Alertes e-mail personnalisées</w:t>
-      </w:r>
-      <w:r>
-        <w:t xml:space="preserve"> </w:t>
-      </w:r>
-      <w:r>
-        <w:t xml:space="preserve">: chaque entreprise reçoit uniquement les opportunités correspondant à son secteur</w:t>
+        <w:t xml:space="preserve">Alertes e-mail personnalisées par secteur</w:t>
+      </w:r>
+      <w:r>
+        <w:t xml:space="preserve"> </w:t>
+      </w:r>
+      <w:r>
+        <w:t xml:space="preserve">: chaque entreprise reçoit uniquement les appels d’offres correspondant à son domaine d’activité</w:t>
       </w:r>
     </w:p>
     <w:p>
@@ -170,13 +170,13 @@
           <w:bCs/>
           <w:b/>
         </w:rPr>
-        <w:t xml:space="preserve">Multi-pays</w:t>
-      </w:r>
-      <w:r>
-        <w:t xml:space="preserve"> </w:t>
-      </w:r>
-      <w:r>
-        <w:t xml:space="preserve">: couverture complète du Bénin, Togo, Côte d’Ivoire et Sénégal depuis une seule plateforme</w:t>
+        <w:t xml:space="preserve">Couverture multi-pays</w:t>
+      </w:r>
+      <w:r>
+        <w:t xml:space="preserve"> </w:t>
+      </w:r>
+      <w:r>
+        <w:t xml:space="preserve">: surveillance complète des marchés publics du Bénin (Cotonou, Porto-Novo), Togo (Lomé), Côte d’Ivoire (Abidjan) et Sénégal (Dakar) depuis une seule plateforme</w:t>
       </w:r>
     </w:p>
     <w:p>
@@ -192,13 +192,13 @@
           <w:bCs/>
           <w:b/>
         </w:rPr>
-        <w:t xml:space="preserve">Analyse IA</w:t>
-      </w:r>
-      <w:r>
-        <w:t xml:space="preserve"> </w:t>
-      </w:r>
-      <w:r>
-        <w:t xml:space="preserve">: résumés structurés de chaque appel d’offres pour gagner du temps</w:t>
+        <w:t xml:space="preserve">Analyse IA des appels d’offres</w:t>
+      </w:r>
+      <w:r>
+        <w:t xml:space="preserve"> </w:t>
+      </w:r>
+      <w:r>
+        <w:t xml:space="preserve">: résumés structurés de chaque opportunité pour gagner du temps</w:t>
       </w:r>
     </w:p>
     <w:p>
@@ -220,7 +220,7 @@
         <w:t xml:space="preserve"> </w:t>
       </w:r>
       <w:r>
-        <w:t xml:space="preserve">: accès direct aux documents officiels (DAO, dossiers techniques)</w:t>
+        <w:t xml:space="preserve">: accès direct aux documents officiels (DAO, dossiers techniques, cahiers des charges)</w:t>
       </w:r>
     </w:p>
     <w:bookmarkEnd w:id="21"/>

</xml_diff>